<commit_message>
Add clickable LinkedIn, GitHub, portfolio and project links to the CV
Co-Authored-By: Claude Code <noreply@anthropic.com>
</commit_message>
<xml_diff>
--- a/cv/Suwaasha_Murugaperumal_CV.docx
+++ b/cv/Suwaasha_Murugaperumal_CV.docx
@@ -24,20 +24,63 @@
           <w:b w:val="0"/>
           <w:i w:val="0"/>
         </w:rPr>
-        <w:t>Leeds, United Kingdom | +44 7352 678656 | suwaashaperumal@gmail.com</w:t>
+        <w:t xml:space="preserve">Leeds, United Kingdom | +44 7352 678656 | </w:t>
       </w:r>
+      <w:hyperlink r:id="rId9">
+        <w:r>
+          <w:rPr>
+            <w:u w:val="single"/>
+            <w:color w:val="1F4E9E"/>
+          </w:rPr>
+          <w:t xml:space="preserve">suwaashaperumal@gmail.com</w:t>
+        </w:r>
+      </w:hyperlink>
     </w:p>
     <w:p>
       <w:pPr>
         <w:jc w:val="center"/>
       </w:pPr>
+      <w:hyperlink r:id="rId10">
+        <w:r>
+          <w:rPr>
+            <w:u w:val="single"/>
+            <w:color w:val="1F4E9E"/>
+          </w:rPr>
+          <w:t xml:space="preserve">linkedin.com/in/suwaasham</w:t>
+        </w:r>
+      </w:hyperlink>
       <w:r>
         <w:rPr>
           <w:b w:val="0"/>
           <w:i w:val="0"/>
         </w:rPr>
-        <w:t>linkedin.com/in/suwaasham | github.com/SuwaashaM</w:t>
+        <w:t xml:space="preserve"> | </w:t>
       </w:r>
+      <w:hyperlink r:id="rId11">
+        <w:r>
+          <w:rPr>
+            <w:u w:val="single"/>
+            <w:color w:val="1F4E9E"/>
+          </w:rPr>
+          <w:t xml:space="preserve">github.com/SuwaashaM</w:t>
+        </w:r>
+      </w:hyperlink>
+      <w:r>
+        <w:rPr>
+          <w:b w:val="0"/>
+          <w:i w:val="0"/>
+        </w:rPr>
+        <w:t xml:space="preserve"> | </w:t>
+      </w:r>
+      <w:hyperlink r:id="rId12">
+        <w:r>
+          <w:rPr>
+            <w:u w:val="single"/>
+            <w:color w:val="1F4E9E"/>
+          </w:rPr>
+          <w:t xml:space="preserve">suwaashaM.github.io</w:t>
+        </w:r>
+      </w:hyperlink>
     </w:p>
     <w:p>
       <w:pPr>
@@ -706,11 +749,20 @@
       </w:pPr>
       <w:r>
         <w:rPr>
-          <w:b w:val="0"/>
+          <w:b/>
           <w:i w:val="0"/>
         </w:rPr>
-        <w:t>Code, tests and documentation: github.com/SuwaashaM/ico-fundraising-prediction</w:t>
+        <w:t xml:space="preserve">Code: </w:t>
       </w:r>
+      <w:hyperlink r:id="rId13">
+        <w:r>
+          <w:rPr>
+            <w:u w:val="single"/>
+            <w:color w:val="1F4E9E"/>
+          </w:rPr>
+          <w:t xml:space="preserve">github.com/SuwaashaM/ico-fundraising-prediction</w:t>
+        </w:r>
+      </w:hyperlink>
     </w:p>
     <w:p>
       <w:pPr>
@@ -741,6 +793,29 @@
         </w:rPr>
         <w:t>Built an interactive Python, Streamlit, OpenCV and NLP application combining computer vision and text processing, reaching approximately 90% model accuracy</w:t>
       </w:r>
+    </w:p>
+    <w:p>
+      <w:pPr>
+        <w:pStyle w:val="ListBullet"/>
+        <w:spacing w:after="20"/>
+        <w:ind w:left="340" w:hanging="227"/>
+      </w:pPr>
+      <w:r>
+        <w:rPr>
+          <w:b/>
+          <w:i w:val="0"/>
+        </w:rPr>
+        <w:t xml:space="preserve">Code: </w:t>
+      </w:r>
+      <w:hyperlink r:id="rId14">
+        <w:r>
+          <w:rPr>
+            <w:u w:val="single"/>
+            <w:color w:val="1F4E9E"/>
+          </w:rPr>
+          <w:t xml:space="preserve">github.com/SuwaashaM/hauntify-halloween-app</w:t>
+        </w:r>
+      </w:hyperlink>
     </w:p>
     <w:p>
       <w:pPr>

</xml_diff>

<commit_message>
Sync internship details with LinkedIn; add Now building line; refresh CV
- IoT internship: DLK Technologies, Chennai, Nov-Dec 2022 (Azure used, not employer)
- Corizo: Jul-Sep 2024
- Hauntify marked as rebuilt and in active development
- Hero tags and meta description aligned with LinkedIn headline
- Public CV (docx, pdf, embedded download) updated to match

Co-Authored-By: Claude Opus 5.5 <noreply@anthropic.com>
Claude-Session: https://claude.ai/code/session_01WAhML484PqCivTZo4rvv3E
</commit_message>
<xml_diff>
--- a/cv/Suwaasha_Murugaperumal_CV.docx
+++ b/cv/Suwaasha_Murugaperumal_CV.docx
@@ -393,7 +393,7 @@
           <w:i w:val="0"/>
         </w:rPr>
         <w:tab/>
-        <w:t>Jul 2024 – Aug 2024</w:t>
+        <w:t>Jul 2024 – Sep 2024</w:t>
       </w:r>
     </w:p>
     <w:p>
@@ -449,7 +449,7 @@
           <w:b/>
           <w:i w:val="0"/>
         </w:rPr>
-        <w:t>Cloud and IoT Intern</w:t>
+        <w:t>Embedded IoT and Cloud Intern</w:t>
       </w:r>
       <w:r>
         <w:rPr>
@@ -457,7 +457,7 @@
           <w:i w:val="0"/>
         </w:rPr>
         <w:tab/>
-        <w:t>Dec 2022 – Jan 2023</w:t>
+        <w:t>Nov 2022 – Dec 2022</w:t>
       </w:r>
     </w:p>
     <w:p>
@@ -469,7 +469,7 @@
           <w:b w:val="0"/>
           <w:i/>
         </w:rPr>
-        <w:t>Microsoft Azure, India</w:t>
+        <w:t>DLK Technologies (on-site, Chennai), India</w:t>
       </w:r>
     </w:p>
     <w:p>
@@ -483,7 +483,7 @@
           <w:b w:val="0"/>
           <w:i w:val="0"/>
         </w:rPr>
-        <w:t>Developed an IoT-based system using Microsoft Azure services</w:t>
+        <w:t>Developed an IoT-based system connecting devices to the cloud with Microsoft Azure services</w:t>
       </w:r>
     </w:p>
     <w:p>

</xml_diff>